<commit_message>
Remove unused files and scripts: deleted Rplots.pdf and pretreat.r; updated Random Forest practical document.
</commit_message>
<xml_diff>
--- a/assignment/docs/Assignment_Brief_MLM_2026.docx
+++ b/assignment/docs/Assignment_Brief_MLM_2026.docx
@@ -7266,21 +7266,6 @@
 </file>
 
 <file path=customXml/item1.xml><?xml version="1.0" encoding="utf-8"?>
-<p:properties xmlns:p="http://schemas.microsoft.com/office/2006/metadata/properties" xmlns:xsi="http://www.w3.org/2001/XMLSchema-instance" xmlns:pc="http://schemas.microsoft.com/office/infopath/2007/PartnerControls">
-  <documentManagement/>
-</p:properties>
-</file>
-
-<file path=customXml/item2.xml><?xml version="1.0" encoding="utf-8"?>
-<?mso-contentType ?>
-<FormTemplates xmlns="http://schemas.microsoft.com/sharepoint/v3/contenttype/forms">
-  <Display>DocumentLibraryForm</Display>
-  <Edit>DocumentLibraryForm</Edit>
-  <New>DocumentLibraryForm</New>
-</FormTemplates>
-</file>
-
-<file path=customXml/item3.xml><?xml version="1.0" encoding="utf-8"?>
 <ct:contentTypeSchema xmlns:ct="http://schemas.microsoft.com/office/2006/metadata/contentType" xmlns:ma="http://schemas.microsoft.com/office/2006/metadata/properties/metaAttributes" ct:_="" ma:_="" ma:contentTypeName="Document" ma:contentTypeID="0x01010049F5DDB62B41D24CB974735F2B5F80B6" ma:contentTypeVersion="13" ma:contentTypeDescription="Create a new document." ma:contentTypeScope="" ma:versionID="36cb6a32d98417850f66978d88bc17e7">
   <xsd:schema xmlns:xsd="http://www.w3.org/2001/XMLSchema" xmlns:xs="http://www.w3.org/2001/XMLSchema" xmlns:p="http://schemas.microsoft.com/office/2006/metadata/properties" xmlns:ns3="62dac45c-a09b-4542-889f-7647871c89a7" xmlns:ns4="5b9dbb6f-f28e-4a32-a7d6-aa04ef18b565" targetNamespace="http://schemas.microsoft.com/office/2006/metadata/properties" ma:root="true" ma:fieldsID="5cf2a7d05231a261f95397b26affa4cc" ns3:_="" ns4:_="">
     <xsd:import namespace="62dac45c-a09b-4542-889f-7647871c89a7"/>
@@ -7503,24 +7488,22 @@
 </ct:contentTypeSchema>
 </file>
 
-<file path=customXml/itemProps1.xml><?xml version="1.0" encoding="utf-8"?>
-<ds:datastoreItem xmlns:ds="http://schemas.openxmlformats.org/officeDocument/2006/customXml" ds:itemID="{9C65DF08-A8DA-4C63-8D38-84DB95AFFB48}">
-  <ds:schemaRefs>
-    <ds:schemaRef ds:uri="http://schemas.microsoft.com/office/2006/metadata/properties"/>
-    <ds:schemaRef ds:uri="http://schemas.microsoft.com/office/infopath/2007/PartnerControls"/>
-  </ds:schemaRefs>
-</ds:datastoreItem>
+<file path=customXml/item2.xml><?xml version="1.0" encoding="utf-8"?>
+<?mso-contentType ?>
+<FormTemplates xmlns="http://schemas.microsoft.com/sharepoint/v3/contenttype/forms">
+  <Display>DocumentLibraryForm</Display>
+  <Edit>DocumentLibraryForm</Edit>
+  <New>DocumentLibraryForm</New>
+</FormTemplates>
 </file>
 
-<file path=customXml/itemProps2.xml><?xml version="1.0" encoding="utf-8"?>
-<ds:datastoreItem xmlns:ds="http://schemas.openxmlformats.org/officeDocument/2006/customXml" ds:itemID="{36E7856F-5629-4D3D-A173-6D1CD510DEC3}">
-  <ds:schemaRefs>
-    <ds:schemaRef ds:uri="http://schemas.microsoft.com/sharepoint/v3/contenttype/forms"/>
-  </ds:schemaRefs>
-</ds:datastoreItem>
+<file path=customXml/item3.xml><?xml version="1.0" encoding="utf-8"?>
+<p:properties xmlns:p="http://schemas.microsoft.com/office/2006/metadata/properties" xmlns:xsi="http://www.w3.org/2001/XMLSchema-instance" xmlns:pc="http://schemas.microsoft.com/office/infopath/2007/PartnerControls">
+  <documentManagement/>
+</p:properties>
 </file>
 
-<file path=customXml/itemProps3.xml><?xml version="1.0" encoding="utf-8"?>
+<file path=customXml/itemProps1.xml><?xml version="1.0" encoding="utf-8"?>
 <ds:datastoreItem xmlns:ds="http://schemas.openxmlformats.org/officeDocument/2006/customXml" ds:itemID="{B5FFE567-5894-4993-878E-57A6DEB5CC75}">
   <ds:schemaRefs>
     <ds:schemaRef ds:uri="http://schemas.microsoft.com/office/2006/metadata/contentType"/>
@@ -7537,4 +7520,21 @@
     <ds:schemaRef ds:uri="http://schemas.microsoft.com/internal/obd"/>
   </ds:schemaRefs>
 </ds:datastoreItem>
+</file>
+
+<file path=customXml/itemProps2.xml><?xml version="1.0" encoding="utf-8"?>
+<ds:datastoreItem xmlns:ds="http://schemas.openxmlformats.org/officeDocument/2006/customXml" ds:itemID="{36E7856F-5629-4D3D-A173-6D1CD510DEC3}">
+  <ds:schemaRefs>
+    <ds:schemaRef ds:uri="http://schemas.microsoft.com/sharepoint/v3/contenttype/forms"/>
+  </ds:schemaRefs>
+</ds:datastoreItem>
+</file>
+
+<file path=customXml/itemProps3.xml><?xml version="1.0" encoding="utf-8"?>
+<ds:datastoreItem xmlns:ds="http://schemas.openxmlformats.org/officeDocument/2006/customXml" ds:itemID="{9C65DF08-A8DA-4C63-8D38-84DB95AFFB48}">
+  <ds:schemaRefs>
+    <ds:schemaRef ds:uri="http://schemas.microsoft.com/office/2006/metadata/properties"/>
+    <ds:schemaRef ds:uri="http://schemas.microsoft.com/office/infopath/2007/PartnerControls"/>
+  </ds:schemaRefs>
+</ds:datastoreItem>
 </file>
</xml_diff>

<commit_message>
Update Practical ML Part A document with latest changes
</commit_message>
<xml_diff>
--- a/assignment/docs/Assignment_Brief_MLM_2026.docx
+++ b/assignment/docs/Assignment_Brief_MLM_2026.docx
@@ -2902,6 +2902,7 @@
           <w:rFonts w:ascii="Times New Roman" w:hAnsi="Times New Roman" w:cs="Times New Roman"/>
         </w:rPr>
       </w:pPr>
+      <w:bookmarkStart w:id="0" w:name="OLE_LINK1"/>
       <w:r>
         <w:rPr>
           <w:rFonts w:ascii="Times New Roman" w:hAnsi="Times New Roman" w:cs="Times New Roman"/>
@@ -3256,7 +3257,21 @@
         <w:rPr>
           <w:rFonts w:ascii="Times New Roman" w:hAnsi="Times New Roman" w:cs="Times New Roman"/>
         </w:rPr>
-        <w:t xml:space="preserve">, and grid search for model tuning. Clearly describe the steps you follow for each process. </w:t>
+        <w:t xml:space="preserve">, and grid search for model tuning. </w:t>
+      </w:r>
+      <w:r>
+        <w:rPr>
+          <w:rFonts w:ascii="Times New Roman" w:hAnsi="Times New Roman" w:cs="Times New Roman"/>
+          <w:b/>
+          <w:bCs/>
+        </w:rPr>
+        <w:t>Clearly describe the steps you follow for each process</w:t>
+      </w:r>
+      <w:r>
+        <w:rPr>
+          <w:rFonts w:ascii="Times New Roman" w:hAnsi="Times New Roman" w:cs="Times New Roman"/>
+        </w:rPr>
+        <w:t xml:space="preserve">. </w:t>
       </w:r>
       <w:r>
         <w:rPr>
@@ -3373,6 +3388,7 @@
         </w:rPr>
         <w:t xml:space="preserve">. </w:t>
       </w:r>
+      <w:bookmarkEnd w:id="0"/>
     </w:p>
     <w:p>
       <w:pPr>
@@ -6977,6 +6993,18 @@
       <w:shd w:val="clear" w:color="auto" w:fill="E1DFDD"/>
     </w:rPr>
   </w:style>
+  <w:style w:type="character" w:styleId="FollowedHyperlink">
+    <w:name w:val="FollowedHyperlink"/>
+    <w:basedOn w:val="DefaultParagraphFont"/>
+    <w:uiPriority w:val="99"/>
+    <w:semiHidden/>
+    <w:unhideWhenUsed/>
+    <w:rsid w:val="006203F3"/>
+    <w:rPr>
+      <w:color w:val="800080" w:themeColor="followedHyperlink"/>
+      <w:u w:val="single"/>
+    </w:rPr>
+  </w:style>
 </w:styles>
 </file>
 

</xml_diff>